<commit_message>
Correct worksheet 4.97 mM entry and publish exact final reviewed DOCX/PDF
</commit_message>
<xml_diff>
--- a/labs/onpg/Worksheet.docx
+++ b/labs/onpg/Worksheet.docx
@@ -3216,15 +3216,8 @@
             <w:vAlign w:val="center"/>
           </w:tcPr>
           <w:p>
-            <w:pPr>
-              <w:spacing w:after="0" w:line="240" w:lineRule="auto"/>
-              <w:jc w:val="center"/>
-            </w:pPr>
             <w:r>
-              <w:rPr>
-                <w:sz w:val="22"/>
-              </w:rPr>
-              <w:t>4.98</w:t>
+              <w:t>4.97</w:t>
             </w:r>
           </w:p>
         </w:tc>

</xml_diff>

<commit_message>
Refine Figure 4 calibration wording and strengthen Stage 6 Question 15
</commit_message>
<xml_diff>
--- a/labs/onpg/Worksheet.docx
+++ b/labs/onpg/Worksheet.docx
@@ -617,76 +617,22 @@
       </w:pPr>
       <w:r>
         <w:rPr>
-          <w:color w:val="1F2F3C"/>
-          <w:sz w:val="22"/>
-          <w:rPrChange w:author="Vanwie, Bernard J" w:date="2026-10-21T15:40:00Z" w16du:dateUtc="2026-10-21T22:40:00Z" w:id="2">
-            <w:rPr/>
-          </w:rPrChange>
+          <w:sz w:val="20"/>
         </w:rPr>
-        <w:t>The supplied experimental ONP calibration is shown in Fig. 4 (</w:t>
+        <w:t>The experimental ONP calibration is shown in Fig. 4. Use the calibration slope of 3.43 mM</w:t>
       </w:r>
       <w:r>
         <w:rPr>
-          <w:color w:val="1F2F3C"/>
-          <w:sz w:val="22"/>
-          <w:rPrChange w:author="Vanwie, Bernard J" w:date="2026-10-21T15:40:00Z" w16du:dateUtc="2026-10-21T22:40:00Z" w:id="2">
-            <w:rPr/>
-          </w:rPrChange>
-        </w:rPr>
-        <w:t>R</w:t>
-      </w:r>
-      <w:r>
-        <w:rPr>
-          <w:color w:val="1F2F3C"/>
-          <w:sz w:val="22"/>
-          <w:rPrChange w:author="Vanwie, Bernard J" w:date="2026-10-21T15:40:00Z" w16du:dateUtc="2026-10-21T22:40:00Z" w:id="2">
-            <w:rPr/>
-          </w:rPrChange>
+          <w:sz w:val="20"/>
           <w:vertAlign w:val="superscript"/>
         </w:rPr>
-        <w:t>2</w:t>
+        <w:t>−1</w:t>
       </w:r>
       <w:r>
         <w:rPr>
-          <w:color w:val="1F2F3C"/>
-          <w:sz w:val="22"/>
-          <w:rPrChange w:author="Vanwie, Bernard J" w:date="2026-10-21T15:40:00Z" w16du:dateUtc="2026-10-21T22:40:00Z" w:id="2">
-            <w:rPr/>
-          </w:rPrChange>
+          <w:sz w:val="20"/>
         </w:rPr>
-        <w:t xml:space="preserve"> = 0.9982). Use the rounded slope of 3.43 mM</w:t>
-      </w:r>
-      <w:r>
-        <w:rPr>
-          <w:rFonts w:ascii="Cambria Math" w:hAnsi="Cambria Math" w:cs="Cambria Math"/>
-          <w:color w:val="1F2F3C"/>
-          <w:sz w:val="22"/>
-          <w:rPrChange w:author="Vanwie, Bernard J" w:date="2026-10-21T15:40:00Z" w16du:dateUtc="2026-10-21T22:40:00Z" w:id="3">
-            <w:rPr/>
-          </w:rPrChange>
-        </w:rPr>
-        <w:t>⁻</w:t>
-      </w:r>
-      <w:r>
-        <w:rPr>
-          <w:rFonts w:cs="Arial"/>
-          <w:color w:val="1F2F3C"/>
-          <w:sz w:val="22"/>
-          <w:rPrChange w:author="Vanwie, Bernard J" w:date="2026-10-21T15:40:00Z" w16du:dateUtc="2026-10-21T22:40:00Z" w:id="4">
-            <w:rPr/>
-          </w:rPrChange>
-        </w:rPr>
-        <w:t>¹</w:t>
-      </w:r>
-      <w:r>
-        <w:rPr>
-          <w:color w:val="1F2F3C"/>
-          <w:sz w:val="22"/>
-          <w:rPrChange w:author="Vanwie, Bernard J" w:date="2026-10-21T15:40:00Z" w16du:dateUtc="2026-10-21T22:40:00Z" w:id="5">
-            <w:rPr/>
-          </w:rPrChange>
-        </w:rPr>
-        <w:t xml:space="preserve"> in this worksheet and the virtual simulation.</w:t>
+        <w:t xml:space="preserve"> throughout this worksheet and the simulation.</w:t>
       </w:r>
     </w:p>
     <w:p>
@@ -984,50 +930,23 @@
         <w:widowControl/>
       </w:pPr>
       <w:r>
-        <w:rPr/>
-        <w:t xml:space="preserve">The eight measured ONP calibration points and the zero-intercept fitted line are shown in Fig. 4. The horizontal axis is ONP concentration [mM]; the vertical axis is dimensionless absorbance at 415 nm. The fitted slope is 3.4337 </w:t>
-      </w:r>
-      <w:r>
-        <w:rPr/>
-        <w:t>mM</w:t>
-      </w:r>
-      <w:r>
         <w:rPr>
+          <w:sz w:val="20"/>
+        </w:rPr>
+        <w:t>Figure 4 shows eight experimental ONP calibration points and the fitted line. The horizontal axis is ONP concentration [mM] and the vertical axis is absorbance at 415 nm. Use 3.43 mM</w:t>
+      </w:r>
+      <w:r>
+        <w:rPr>
+          <w:sz w:val="20"/>
           <w:vertAlign w:val="superscript"/>
         </w:rPr>
-        <w:t>-1</w:t>
-      </w:r>
-      <w:r>
-        <w:rPr/>
-        <w:t xml:space="preserve"> (</w:t>
-      </w:r>
-      <w:r>
-        <w:rPr/>
-        <w:t>R</w:t>
+        <w:t>−1</w:t>
       </w:r>
       <w:r>
         <w:rPr>
-          <w:vertAlign w:val="superscript"/>
+          <w:sz w:val="20"/>
         </w:rPr>
-        <w:t>2</w:t>
-      </w:r>
-      <w:r>
-        <w:rPr/>
-        <w:t xml:space="preserve"> = 0.9982). Use 3.43 </w:t>
-      </w:r>
-      <w:r>
-        <w:rPr/>
-        <w:t>mM</w:t>
-      </w:r>
-      <w:r>
-        <w:rPr>
-          <w:vertAlign w:val="superscript"/>
-        </w:rPr>
-        <w:t>-1</w:t>
-      </w:r>
-      <w:r>
-        <w:rPr/>
-        <w:t xml:space="preserve"> for calculations.</w:t>
+        <w:t xml:space="preserve"> as the calibration slope.</w:t>
       </w:r>
     </w:p>
     <w:p>
@@ -1065,49 +984,7 @@
       </w:pPr>
       <w:r>
         <w:rPr/>
-        <w:t xml:space="preserve">Fig. 4  Experimental ONP calibration data (zero-intercept fit: 3.4337 </w:t>
-      </w:r>
-      <w:r>
-        <w:rPr/>
-        <w:t>mM</w:t>
-      </w:r>
-      <w:r>
-        <w:rPr>
-          <w:vertAlign w:val="superscript"/>
-        </w:rPr>
-        <w:t>-1</w:t>
-      </w:r>
-      <w:r>
-        <w:rPr/>
-        <w:t xml:space="preserve">, </w:t>
-      </w:r>
-      <w:r>
-        <w:rPr/>
-        <w:t>R</w:t>
-      </w:r>
-      <w:r>
-        <w:rPr>
-          <w:vertAlign w:val="superscript"/>
-        </w:rPr>
-        <w:t>2</w:t>
-      </w:r>
-      <w:r>
-        <w:rPr/>
-        <w:t xml:space="preserve"> = 0.9982). Use 3.43 </w:t>
-      </w:r>
-      <w:r>
-        <w:rPr/>
-        <w:t>mM</w:t>
-      </w:r>
-      <w:r>
-        <w:rPr>
-          <w:vertAlign w:val="superscript"/>
-        </w:rPr>
-        <w:t>-1</w:t>
-      </w:r>
-      <w:r>
-        <w:rPr/>
-        <w:t xml:space="preserve"> for calculations.</w:t>
+        <w:t>Fig. 4  Experimental ONP calibration data.</w:t>
       </w:r>
     </w:p>
     <w:p>
@@ -4324,36 +4201,48 @@
         <w:pStyle w:val="Smallnote"/>
       </w:pPr>
       <w:r>
-        <w:rPr/>
-        <w:t xml:space="preserve">The 39.8 mM trace in Stages 4 and 5 is a simulated Michaelis–Menten extension, not an additional laboratory measurement. The reference uses </w:t>
-      </w:r>
-      <w:r>
-        <w:rPr/>
+        <w:rPr>
+          <w:sz w:val="20"/>
+        </w:rPr>
+        <w:t xml:space="preserve">The first six Stage 4 rates are supplied assay data. The 39.8 mM rate is calculated using the Stage 5 Michaelis–Menten relationship with </w:t>
+      </w:r>
+      <w:r>
+        <w:rPr>
+          <w:sz w:val="20"/>
+        </w:rPr>
         <w:t>K</w:t>
       </w:r>
       <w:r>
         <w:rPr>
+          <w:sz w:val="20"/>
           <w:vertAlign w:val="subscript"/>
         </w:rPr>
         <w:t>m</w:t>
       </w:r>
       <w:r>
-        <w:rPr/>
+        <w:rPr>
+          <w:sz w:val="20"/>
+        </w:rPr>
         <w:t xml:space="preserve"> = 2.00 mM and </w:t>
       </w:r>
       <w:r>
-        <w:rPr/>
+        <w:rPr>
+          <w:sz w:val="20"/>
+        </w:rPr>
         <w:t>V</w:t>
       </w:r>
       <w:r>
         <w:rPr>
+          <w:sz w:val="20"/>
           <w:vertAlign w:val="subscript"/>
         </w:rPr>
         <w:t>max</w:t>
       </w:r>
       <w:r>
-        <w:rPr/>
-        <w:t xml:space="preserve"> = 0.002510 mM/s, anchored to the supplied 19.9 mM rate. The model assumes no substrate inhibition.</w:t>
+        <w:rPr>
+          <w:sz w:val="20"/>
+        </w:rPr>
+        <w:t xml:space="preserve"> = 0.002510 mM/s.</w:t>
       </w:r>
     </w:p>
     <w:p>
@@ -5719,16 +5608,67 @@
         <w:ind w:left="331" w:hanging="331"/>
       </w:pPr>
       <w:r>
-        <w:t>15. Which of the two assigned bead diameters (0.6 mm or 0.3 mm) satisfies η</w:t>
-      </w:r>
-      <w:r>
         <w:rPr>
+          <w:sz w:val="20"/>
+        </w:rPr>
+        <w:t xml:space="preserve">15. Calculate the ratio of center to surface ONPG concentration for both assigned bead diameters (0.6 mm and 0.3 mm): </w:t>
+      </w:r>
+      <w:r>
+        <w:rPr>
+          <w:sz w:val="20"/>
+        </w:rPr>
+        <w:t>C</w:t>
+      </w:r>
+      <w:r>
+        <w:rPr>
+          <w:sz w:val="20"/>
+          <w:vertAlign w:val="subscript"/>
+        </w:rPr>
+        <w:t>ONPG,center</w:t>
+      </w:r>
+      <w:r>
+        <w:rPr>
+          <w:sz w:val="20"/>
+        </w:rPr>
+        <w:t xml:space="preserve"> / </w:t>
+      </w:r>
+      <w:r>
+        <w:rPr>
+          <w:sz w:val="20"/>
+        </w:rPr>
+        <w:t>C</w:t>
+      </w:r>
+      <w:r>
+        <w:rPr>
+          <w:sz w:val="20"/>
+          <w:vertAlign w:val="subscript"/>
+        </w:rPr>
+        <w:t>ONPG,surface</w:t>
+      </w:r>
+      <w:r>
+        <w:rPr>
+          <w:sz w:val="20"/>
+        </w:rPr>
+        <w:t xml:space="preserve">. Compare these ratios with the corresponding effectiveness factors, </w:t>
+      </w:r>
+      <w:r>
+        <w:rPr>
+          <w:sz w:val="20"/>
+        </w:rPr>
+        <w:t>η</w:t>
+      </w:r>
+      <w:r>
+        <w:rPr>
+          <w:sz w:val="20"/>
           <w:vertAlign w:val="subscript"/>
         </w:rPr>
         <w:t>i</w:t>
       </w:r>
       <w:r>
-        <w:t xml:space="preserve"> ≥ 0.95? Use both ONPG concentration profiles and the internal effectiveness factors to support your answer.</w:t>
+        <w:rPr>
+          <w:sz w:val="20"/>
+        </w:rPr>
+        <w:t>. What does each quantity tell you about internal substrate distribution and reaction performance?</w:t>
       </w:r>
     </w:p>
     <w:p>
@@ -6868,79 +6808,53 @@
     </w:p>
     <w:p>
       <w:pPr>
-        <w:pStyle w:val="Smallnote"/>
+        <w:keepLines/>
         <w:widowControl/>
-      </w:pPr>
-      <w:r>
-        <w:rPr/>
-        <w:t>The six-rate reciprocal regression need not match the Stage 5 reference (</w:t>
-      </w:r>
-      <w:r>
-        <w:rPr/>
+        <w:spacing w:after="100"/>
+      </w:pPr>
+      <w:r>
+        <w:rPr>
+          <w:sz w:val="20"/>
+        </w:rPr>
+        <w:t xml:space="preserve">Report the reciprocal-plot slope and intercept with units, then use them to calculate </w:t>
+      </w:r>
+      <w:r>
+        <w:rPr>
+          <w:sz w:val="20"/>
+        </w:rPr>
+        <w:t>V</w:t>
+      </w:r>
+      <w:r>
+        <w:rPr>
+          <w:sz w:val="20"/>
+          <w:vertAlign w:val="subscript"/>
+        </w:rPr>
+        <w:t>max</w:t>
+      </w:r>
+      <w:r>
+        <w:rPr>
+          <w:sz w:val="20"/>
+        </w:rPr>
+        <w:t xml:space="preserve"> and </w:t>
+      </w:r>
+      <w:r>
+        <w:rPr>
+          <w:sz w:val="20"/>
+        </w:rPr>
         <w:t>K</w:t>
       </w:r>
       <w:r>
         <w:rPr>
+          <w:sz w:val="20"/>
           <w:vertAlign w:val="subscript"/>
         </w:rPr>
         <w:t>m</w:t>
       </w:r>
       <w:r>
-        <w:rPr/>
-        <w:t xml:space="preserve"> = 2.00 mM, </w:t>
-      </w:r>
-      <w:r>
-        <w:rPr/>
-        <w:t>V</w:t>
-      </w:r>
-      <w:r>
         <w:rPr>
-          <w:vertAlign w:val="subscript"/>
+          <w:sz w:val="20"/>
         </w:rPr>
-        <w:t>max</w:t>
-      </w:r>
-      <w:r>
-        <w:rPr/>
-        <w:t xml:space="preserve"> = 0.002510 mM/s), which is anchored to the 19.9 mM supplied rate rather than globally fitted. Reciprocal fitting also changes the weighting of experimental errors.</w:t>
-      </w:r>
-    </w:p>
-    <w:p>
-      <w:pPr>
-        <w:keepLines/>
-        <w:widowControl/>
-        <w:spacing w:after="100"/>
-      </w:pPr>
-      <w:r>
-        <w:rPr/>
-        <w:t xml:space="preserve">Write the slope and intercept of your line and show how they give </w:t>
-      </w:r>
-      <w:r>
-        <w:rPr/>
-        <w:t>V</w:t>
-      </w:r>
-      <w:r>
-        <w:rPr>
-          <w:vertAlign w:val="subscript"/>
-        </w:rPr>
-        <w:t>max</w:t>
-      </w:r>
-      <w:r>
-        <w:rPr/>
-        <w:t xml:space="preserve"> and </w:t>
-      </w:r>
-      <w:r>
-        <w:rPr/>
-        <w:t>K</w:t>
-      </w:r>
-      <w:r>
-        <w:rPr>
-          <w:vertAlign w:val="subscript"/>
-        </w:rPr>
-        <w:t>m</w:t>
-      </w:r>
-      <w:r>
-        <w:rPr/>
-        <w:t>. Briefly explain why the reciprocal fit differs from the Stage 5 reference.</w:t>
+        <w:t>. Show your substitutions.</w:t>
       </w:r>
     </w:p>
     <w:p>

</xml_diff>